<commit_message>
Korrektur: Eartheffect AG statt GmbH im Vergabe-Kit
</commit_message>
<xml_diff>
--- a/EcoGastroCert_Vergabe-Kit.docx
+++ b/EcoGastroCert_Vergabe-Kit.docx
@@ -112,7 +112,7 @@
         <w:spacing w:after="160" w:line="300"/>
       </w:pPr>
       <w:r>
-        <w:t xml:space="preserve">Träger des Programms ist Eartheffect GmbH, entwickelt mit Unterstützung von EnergieSchweiz (Programm des Bundes für Energieeffizienz und erneuerbare Energien) und dem Verband Schweizer Gastroplaner. Die Bewertung erfolgt durch unabhängige, geschulte Auditorinnen und Auditoren.</w:t>
+        <w:t xml:space="preserve">Träger des Programms ist Eartheffect AG, entwickelt mit Unterstützung von EnergieSchweiz (Programm des Bundes für Energieeffizienz und erneuerbare Energien) und dem Verband Schweizer Gastroplaner. Die Bewertung erfolgt durch unabhängige, geschulte Auditorinnen und Auditoren.</w:t>
       </w:r>
     </w:p>
     <w:p>
@@ -262,7 +262,7 @@
           <w:i/>
           <w:iCs/>
         </w:rPr>
-        <w:t xml:space="preserve">„Die Anbieterin/der Anbieter weist nach, dass die geplante bzw. betriebene gewerbliche Küche nach EcoGastroCert (Eartheffect GmbH, in Zusammenarbeit mit EnergieSchweiz und dem Verband Schweizer Gastroplaner) zertifiziert ist oder eine gleichwertige, unabhängige Zertifizierung von Planung und Betrieb hinsichtlich Energieeffizienz vorlegt. Der Nachweis kann in Form eines gültigen Teilzertifikats 1 (Planung/Bau) bei Ausschreibungen für Neu- oder Umbauten bzw. eines Vollzertifikats (Planung und Betrieb) bei bereits betriebenen Küchen erfolgen. Die erreichte Zertifizierungsstufe (Basis/Silber/Gold) wird zusätzlich bewertet."</w:t>
+        <w:t xml:space="preserve">„Die Anbieterin/der Anbieter weist nach, dass die geplante bzw. betriebene gewerbliche Küche nach EcoGastroCert (Eartheffect AG, in Zusammenarbeit mit EnergieSchweiz und dem Verband Schweizer Gastroplaner) zertifiziert ist oder eine gleichwertige, unabhängige Zertifizierung von Planung und Betrieb hinsichtlich Energieeffizienz vorlegt. Der Nachweis kann in Form eines gültigen Teilzertifikats 1 (Planung/Bau) bei Ausschreibungen für Neu- oder Umbauten bzw. eines Vollzertifikats (Planung und Betrieb) bei bereits betriebenen Küchen erfolgen. Die erreichte Zertifizierungsstufe (Basis/Silber/Gold) wird zusätzlich bewertet."</w:t>
       </w:r>
     </w:p>
     <w:p>
@@ -651,7 +651,7 @@
         <w:spacing w:after="160" w:line="300"/>
       </w:pPr>
       <w:r>
-        <w:t xml:space="preserve">Für Rückfragen zur Formulierung, zur Einordnung im konkreten Vergabeverfahren oder für eine Liste bereits zertifizierter Referenzobjekte steht Eartheffect GmbH zur Verfügung.</w:t>
+        <w:t xml:space="preserve">Für Rückfragen zur Formulierung, zur Einordnung im konkreten Vergabeverfahren oder für eine Liste bereits zertifizierter Referenzobjekte steht Eartheffect AG zur Verfügung.</w:t>
       </w:r>
     </w:p>
     <w:p>
@@ -663,7 +663,7 @@
           <w:b/>
           <w:bCs/>
         </w:rPr>
-        <w:t xml:space="preserve">Eartheffect GmbH</w:t>
+        <w:t xml:space="preserve">Eartheffect AG</w:t>
       </w:r>
     </w:p>
     <w:p>
@@ -744,7 +744,7 @@
         <w:sz w:val="16"/>
         <w:szCs w:val="16"/>
       </w:rPr>
-      <w:t xml:space="preserve">EcoGastroCert · ein Programm von Eartheffect GmbH, mit Unterstützung von EnergieSchweiz und dem Verband Schweizer Gastroplaner · Seite </w:t>
+      <w:t xml:space="preserve">EcoGastroCert · ein Programm von Eartheffect AG, mit Unterstützung von EnergieSchweiz und dem Verband Schweizer Gastroplaner · Seite </w:t>
     </w:r>
     <w:r>
       <w:rPr>

</xml_diff>

<commit_message>
Vergabe-Kit: Blau (#1e3770) statt Gruen, passend zur EcoGastro-Marke
</commit_message>
<xml_diff>
--- a/EcoGastroCert_Vergabe-Kit.docx
+++ b/EcoGastroCert_Vergabe-Kit.docx
@@ -11,7 +11,7 @@
         <w:rPr>
           <w:b/>
           <w:bCs/>
-          <w:color w:val="2E7D32"/>
+          <w:color w:val="1E3770"/>
           <w:sz w:val="56"/>
           <w:szCs w:val="56"/>
         </w:rPr>
@@ -230,10 +230,10 @@
     <w:p>
       <w:pPr>
         <w:pBdr>
-          <w:top w:val="single" w:color="2E7D32" w:sz="6"/>
-          <w:bottom w:val="single" w:color="2E7D32" w:sz="6"/>
-          <w:left w:val="single" w:color="2E7D32" w:sz="6"/>
-          <w:right w:val="single" w:color="2E7D32" w:sz="6"/>
+          <w:top w:val="single" w:color="1E3770" w:sz="6"/>
+          <w:bottom w:val="single" w:color="1E3770" w:sz="6"/>
+          <w:left w:val="single" w:color="1E3770" w:sz="6"/>
+          <w:right w:val="single" w:color="1E3770" w:sz="6"/>
         </w:pBdr>
         <w:shd w:fill="F2F2F2" w:val="clear"/>
         <w:spacing w:after="120" w:before="120"/>
@@ -251,8 +251,8 @@
     <w:p>
       <w:pPr>
         <w:pBdr>
-          <w:left w:val="single" w:color="2E7D32" w:sz="6"/>
-          <w:right w:val="single" w:color="2E7D32" w:sz="6"/>
+          <w:left w:val="single" w:color="1E3770" w:sz="6"/>
+          <w:right w:val="single" w:color="1E3770" w:sz="6"/>
         </w:pBdr>
         <w:shd w:fill="F2F2F2" w:val="clear"/>
         <w:spacing w:after="120"/>
@@ -268,9 +268,9 @@
     <w:p>
       <w:pPr>
         <w:pBdr>
-          <w:bottom w:val="single" w:color="2E7D32" w:sz="6"/>
-          <w:left w:val="single" w:color="2E7D32" w:sz="6"/>
-          <w:right w:val="single" w:color="2E7D32" w:sz="6"/>
+          <w:bottom w:val="single" w:color="1E3770" w:sz="6"/>
+          <w:left w:val="single" w:color="1E3770" w:sz="6"/>
+          <w:right w:val="single" w:color="1E3770" w:sz="6"/>
         </w:pBdr>
         <w:shd w:fill="F2F2F2" w:val="clear"/>
         <w:spacing w:after="240"/>
@@ -324,7 +324,7 @@
         <w:tc>
           <w:tcPr>
             <w:tcW w:type="dxa" w:w="4819"/>
-            <w:shd w:fill="2E7D32" w:val="clear"/>
+            <w:shd w:fill="1E3770" w:val="clear"/>
           </w:tcPr>
           <w:p>
             <w:r>
@@ -340,7 +340,7 @@
         <w:tc>
           <w:tcPr>
             <w:tcW w:type="dxa" w:w="2409"/>
-            <w:shd w:fill="2E7D32" w:val="clear"/>
+            <w:shd w:fill="1E3770" w:val="clear"/>
           </w:tcPr>
           <w:p>
             <w:r>
@@ -356,7 +356,7 @@
         <w:tc>
           <w:tcPr>
             <w:tcW w:type="dxa" w:w="2410"/>
-            <w:shd w:fill="2E7D32" w:val="clear"/>
+            <w:shd w:fill="1E3770" w:val="clear"/>
           </w:tcPr>
           <w:p>
             <w:r>
@@ -1129,7 +1129,7 @@
       <w:rFonts w:ascii="Calibri" w:cs="Calibri" w:eastAsia="Calibri" w:hAnsi="Calibri"/>
       <w:b/>
       <w:bCs/>
-      <w:color w:val="2E7D32"/>
+      <w:color w:val="1E3770"/>
       <w:sz w:val="30"/>
       <w:szCs w:val="30"/>
     </w:rPr>

</xml_diff>

<commit_message>
Vergabe-Kit: echtes Logo-Bild eingebettet
</commit_message>
<xml_diff>
--- a/EcoGastroCert_Vergabe-Kit.docx
+++ b/EcoGastroCert_Vergabe-Kit.docx
@@ -4,9 +4,49 @@
   <w:body>
     <w:p>
       <w:pPr>
-        <w:spacing w:after="60"/>
+        <w:spacing w:after="160"/>
         <w:jc w:val="center"/>
       </w:pPr>
+      <w:r>
+        <w:drawing>
+          <wp:inline distT="0" distB="0" distL="0" distR="0">
+            <wp:extent cx="1905000" cy="914400"/>
+            <wp:effectExtent t="0" r="0" b="0" l="0"/>
+            <wp:docPr id="1" name="" descr="" title=""/>
+            <wp:cNvGraphicFramePr>
+              <a:graphicFrameLocks xmlns:a="http://schemas.openxmlformats.org/drawingml/2006/main" noChangeAspect="1"/>
+            </wp:cNvGraphicFramePr>
+            <a:graphic xmlns:a="http://schemas.openxmlformats.org/drawingml/2006/main">
+              <a:graphicData uri="http://schemas.openxmlformats.org/drawingml/2006/picture">
+                <pic:pic xmlns:pic="http://schemas.openxmlformats.org/drawingml/2006/picture">
+                  <pic:nvPicPr>
+                    <pic:cNvPr id="0" name="" descr=""/>
+                    <pic:cNvPicPr>
+                      <a:picLocks noChangeAspect="1" noChangeArrowheads="1"/>
+                    </pic:cNvPicPr>
+                  </pic:nvPicPr>
+                  <pic:blipFill>
+                    <a:blip r:embed="rId9" cstate="none"/>
+                    <a:srcRect/>
+                    <a:stretch>
+                      <a:fillRect/>
+                    </a:stretch>
+                  </pic:blipFill>
+                  <pic:spPr bwMode="auto">
+                    <a:xfrm>
+                      <a:off x="0" y="0"/>
+                      <a:ext cx="1905000" cy="914400"/>
+                    </a:xfrm>
+                    <a:prstGeom prst="rect">
+                      <a:avLst/>
+                    </a:prstGeom>
+                  </pic:spPr>
+                </pic:pic>
+              </a:graphicData>
+            </a:graphic>
+          </wp:inline>
+        </w:drawing>
+      </w:r>
       <w:r>
         <w:rPr>
           <w:b/>
@@ -15,7 +55,7 @@
           <w:sz w:val="56"/>
           <w:szCs w:val="56"/>
         </w:rPr>
-        <w:t xml:space="preserve">EcoGastroCert</w:t>
+        <w:t xml:space="preserve">  Cert</w:t>
       </w:r>
     </w:p>
     <w:p>

</xml_diff>

<commit_message>
Vergabe-Kit: Logo-Layout und Tabellenumbruch korrigiert
</commit_message>
<xml_diff>
--- a/EcoGastroCert_Vergabe-Kit.docx
+++ b/EcoGastroCert_Vergabe-Kit.docx
@@ -4,13 +4,13 @@
   <w:body>
     <w:p>
       <w:pPr>
-        <w:spacing w:after="160"/>
+        <w:spacing w:after="200"/>
         <w:jc w:val="center"/>
       </w:pPr>
       <w:r>
         <w:drawing>
           <wp:inline distT="0" distB="0" distL="0" distR="0">
-            <wp:extent cx="1905000" cy="914400"/>
+            <wp:extent cx="2286000" cy="1095375"/>
             <wp:effectExtent t="0" r="0" b="0" l="0"/>
             <wp:docPr id="1" name="" descr="" title=""/>
             <wp:cNvGraphicFramePr>
@@ -35,7 +35,7 @@
                   <pic:spPr bwMode="auto">
                     <a:xfrm>
                       <a:off x="0" y="0"/>
-                      <a:ext cx="1905000" cy="914400"/>
+                      <a:ext cx="2286000" cy="1095375"/>
                     </a:xfrm>
                     <a:prstGeom prst="rect">
                       <a:avLst/>
@@ -47,15 +47,21 @@
           </wp:inline>
         </w:drawing>
       </w:r>
+    </w:p>
+    <w:p>
+      <w:pPr>
+        <w:spacing w:after="60"/>
+        <w:jc w:val="center"/>
+      </w:pPr>
       <w:r>
         <w:rPr>
           <w:b/>
           <w:bCs/>
           <w:color w:val="1E3770"/>
-          <w:sz w:val="56"/>
-          <w:szCs w:val="56"/>
+          <w:sz w:val="48"/>
+          <w:szCs w:val="48"/>
         </w:rPr>
-        <w:t xml:space="preserve">  Cert</w:t>
+        <w:t xml:space="preserve">EcoGastroCert</w:t>
       </w:r>
     </w:p>
     <w:p>
@@ -359,6 +365,7 @@
       </w:tblGrid>
       <w:tr>
         <w:trPr>
+          <w:cantSplit/>
           <w:tblHeader/>
         </w:trPr>
         <w:tc>
@@ -411,6 +418,9 @@
         </w:tc>
       </w:tr>
       <w:tr>
+        <w:trPr>
+          <w:cantSplit/>
+        </w:trPr>
         <w:tc>
           <w:tcPr>
             <w:tcW w:type="dxa" w:w="4819"/>
@@ -451,6 +461,9 @@
         </w:tc>
       </w:tr>
       <w:tr>
+        <w:trPr>
+          <w:cantSplit/>
+        </w:trPr>
         <w:tc>
           <w:tcPr>
             <w:tcW w:type="dxa" w:w="4819"/>
@@ -491,6 +504,9 @@
         </w:tc>
       </w:tr>
       <w:tr>
+        <w:trPr>
+          <w:cantSplit/>
+        </w:trPr>
         <w:tc>
           <w:tcPr>
             <w:tcW w:type="dxa" w:w="4819"/>
@@ -531,6 +547,9 @@
         </w:tc>
       </w:tr>
       <w:tr>
+        <w:trPr>
+          <w:cantSplit/>
+        </w:trPr>
         <w:tc>
           <w:tcPr>
             <w:tcW w:type="dxa" w:w="4819"/>
@@ -571,6 +590,9 @@
         </w:tc>
       </w:tr>
       <w:tr>
+        <w:trPr>
+          <w:cantSplit/>
+        </w:trPr>
         <w:tc>
           <w:tcPr>
             <w:tcW w:type="dxa" w:w="4819"/>

</xml_diff>